<commit_message>
Add a Prompt Library: AI prompts for everyday agile work
36 prompts grouped like the home page, each with when to use it, a copy
button, a watch-out and the board it pairs with, plus every board's
whiteboard prompt in one searchable list. Generated by build_prompts.py;
linked from the Start here strip and the two AI guides.

Co-Authored-By: Claude Opus 5.5 <noreply@anthropic.com>
</commit_message>
<xml_diff>
--- a/facilitator-guide-ai-delivery.docx
+++ b/facilitator-guide-ai-delivery.docx
@@ -883,7 +883,13 @@
     </w:p>
     <w:p>
       <w:r>
-        <w:t xml:space="preserve">Teams turn this into daily practice with the </w:t>
+        <w:t xml:space="preserve">The </w:t>
+      </w:r>
+      <w:r>
+        <w:t xml:space="preserve">Prompt Library</w:t>
+      </w:r>
+      <w:r>
+        <w:t xml:space="preserve"> has ready-made prompts for everyday agile work. Teams turn this into daily practice with the </w:t>
       </w:r>
       <w:r>
         <w:t xml:space="preserve">AI Working Agreement</w:t>

</xml_diff>